<commit_message>
Regenerate report, screenshots and answers from the run on Anusha's PC
Co-Authored-By: Claude Opus 5.5 <noreply@anthropic.com>
Claude-Session: https://claude.ai/code/session_01CwWXYS15SKWvDTqAeno1XS
</commit_message>
<xml_diff>
--- a/report/Exp08_Report_2024300032_Anusha_Dalal.docx
+++ b/report/Exp08_Report_2024300032_Anusha_Dalal.docx
@@ -864,7 +864,7 @@
                 <w:b/>
                 <w:sz w:val="18"/>
               </w:rPr>
-              <w:t>Intel(R) Xeon(R) Processor @ 2.80GHz</w:t>
+              <w:t>12th Gen Intel(R) Core(TM) i5-1235U</w:t>
             </w:r>
           </w:p>
         </w:tc>
@@ -878,7 +878,7 @@
                 <w:b w:val="0"/>
                 <w:sz w:val="18"/>
               </w:rPr>
-              <w:t>4 / 4</w:t>
+              <w:t>12 threads (logical CPUs)</w:t>
             </w:r>
           </w:p>
         </w:tc>
@@ -892,7 +892,7 @@
                 <w:b w:val="0"/>
                 <w:sz w:val="18"/>
               </w:rPr>
-              <w:t>15 GiB</w:t>
+              <w:t>3.7 GiB</w:t>
             </w:r>
           </w:p>
         </w:tc>
@@ -906,7 +906,7 @@
                 <w:b w:val="0"/>
                 <w:sz w:val="18"/>
               </w:rPr>
-              <w:t>Ubuntu 24.04.5 LTS (kernel 6.18.44-fc-v139)</w:t>
+              <w:t>Ubuntu 24.04.5 LTS (kernel 6.6.87.2-microsoft-standard-WSL2)</w:t>
             </w:r>
           </w:p>
         </w:tc>
@@ -1076,7 +1076,7 @@
       <w:r>
         <w:drawing>
           <wp:inline xmlns:a="http://schemas.openxmlformats.org/drawingml/2006/main" xmlns:pic="http://schemas.openxmlformats.org/drawingml/2006/picture">
-            <wp:extent cx="6120000" cy="5287286"/>
+            <wp:extent cx="6120000" cy="5596196"/>
             <wp:docPr id="3" name="Picture 3"/>
             <wp:cNvGraphicFramePr>
               <a:graphicFrameLocks noChangeAspect="1"/>
@@ -1097,7 +1097,7 @@
                   <pic:spPr>
                     <a:xfrm>
                       <a:off x="0" y="0"/>
-                      <a:ext cx="6120000" cy="5287286"/>
+                      <a:ext cx="6120000" cy="5596196"/>
                     </a:xfrm>
                     <a:prstGeom prst="rect"/>
                   </pic:spPr>
@@ -1172,7 +1172,7 @@
       <w:r>
         <w:drawing>
           <wp:inline xmlns:a="http://schemas.openxmlformats.org/drawingml/2006/main" xmlns:pic="http://schemas.openxmlformats.org/drawingml/2006/picture">
-            <wp:extent cx="6120000" cy="6008076"/>
+            <wp:extent cx="6120000" cy="6316986"/>
             <wp:docPr id="5" name="Picture 5"/>
             <wp:cNvGraphicFramePr>
               <a:graphicFrameLocks noChangeAspect="1"/>
@@ -1193,7 +1193,7 @@
                   <pic:spPr>
                     <a:xfrm>
                       <a:off x="0" y="0"/>
-                      <a:ext cx="6120000" cy="6008076"/>
+                      <a:ext cx="6120000" cy="6316986"/>
                     </a:xfrm>
                     <a:prstGeom prst="rect"/>
                   </pic:spPr>
@@ -2813,7 +2813,7 @@
           <w:i/>
           <w:sz w:val="18"/>
         </w:rPr>
-        <w:t>Test 3 flipped bit 0 of the signature byte at index UID mod length: ECDSA byte 4 (0x00 -&gt; 0x01), RSA-PSS byte 256 (0x9b -&gt; 0x9a), ML-DSA byte 1492 (0x09 -&gt; 0x08), SLH-DSA byte 5232 (0x53 -&gt; 0x52). Test 4: the receiver generated its own key pairs; for ECDSA an independent key from the secure random generator was used (keygen.py ecdsa --independent), because a UID-derived key would be identical to the sender's key. cmp confirmed all four receiver public keys differ from the sender's.</w:t>
+        <w:t>Test 3 flipped bit 0 of the signature byte at index UID mod length: ECDSA byte 4 (0x65 -&gt; 0x64), RSA-PSS byte 256 (0x19 -&gt; 0x18), ML-DSA byte 1492 (0x78 -&gt; 0x79), SLH-DSA byte 5232 (0xf9 -&gt; 0xf8). Test 4: the receiver generated its own key pairs; for ECDSA an independent key from the secure random generator was used (keygen.py ecdsa --independent), because a UID-derived key would be identical to the sender's key. cmp confirmed all four receiver public keys differ from the sender's.</w:t>
       </w:r>
     </w:p>
     <w:p>
@@ -3105,7 +3105,7 @@
                 <w:b w:val="0"/>
                 <w:sz w:val="19"/>
               </w:rPr>
-              <w:t>0.0765 ± 0.0187</w:t>
+              <w:t>0.0922 ± 0.0324</w:t>
             </w:r>
           </w:p>
         </w:tc>
@@ -3122,7 +3122,7 @@
                 <w:b w:val="0"/>
                 <w:sz w:val="19"/>
               </w:rPr>
-              <w:t>0.0558 ± 0.0225</w:t>
+              <w:t>0.0442 ± 0.0087</w:t>
             </w:r>
           </w:p>
         </w:tc>
@@ -3139,7 +3139,7 @@
                 <w:b w:val="0"/>
                 <w:sz w:val="19"/>
               </w:rPr>
-              <w:t>0.1291 ± 0.0261</w:t>
+              <w:t>0.1239 ± 0.0092</w:t>
             </w:r>
           </w:p>
         </w:tc>
@@ -3156,7 +3156,7 @@
                 <w:b w:val="0"/>
                 <w:sz w:val="19"/>
               </w:rPr>
-              <w:t>0.43</w:t>
+              <w:t>0.36</w:t>
             </w:r>
           </w:p>
         </w:tc>
@@ -3192,7 +3192,7 @@
                 <w:b w:val="0"/>
                 <w:sz w:val="19"/>
               </w:rPr>
-              <w:t>215.7596 ± 172.9181</w:t>
+              <w:t>198.1258 ± 102.1346</w:t>
             </w:r>
           </w:p>
         </w:tc>
@@ -3209,7 +3209,7 @@
                 <w:b w:val="0"/>
                 <w:sz w:val="19"/>
               </w:rPr>
-              <w:t>2.2231 ± 0.6104</w:t>
+              <w:t>1.3343 ± 0.0675</w:t>
             </w:r>
           </w:p>
         </w:tc>
@@ -3226,7 +3226,7 @@
                 <w:b w:val="0"/>
                 <w:sz w:val="19"/>
               </w:rPr>
-              <w:t>0.0589 ± 0.0108</w:t>
+              <w:t>0.0342 ± 0.0017</w:t>
             </w:r>
           </w:p>
         </w:tc>
@@ -3243,7 +3243,7 @@
                 <w:b w:val="0"/>
                 <w:sz w:val="19"/>
               </w:rPr>
-              <w:t>37.74</w:t>
+              <w:t>39.01</w:t>
             </w:r>
           </w:p>
         </w:tc>
@@ -3279,7 +3279,7 @@
                 <w:b w:val="0"/>
                 <w:sz w:val="19"/>
               </w:rPr>
-              <w:t>0.0454 ± 0.0099</w:t>
+              <w:t>0.0250 ± 0.0006</w:t>
             </w:r>
           </w:p>
         </w:tc>
@@ -3296,7 +3296,7 @@
                 <w:b w:val="0"/>
                 <w:sz w:val="19"/>
               </w:rPr>
-              <w:t>0.1041 ± 0.0572</w:t>
+              <w:t>0.0659 ± 0.0337</w:t>
             </w:r>
           </w:p>
         </w:tc>
@@ -3313,7 +3313,7 @@
                 <w:b w:val="0"/>
                 <w:sz w:val="19"/>
               </w:rPr>
-              <w:t>0.0357 ± 0.0067</w:t>
+              <w:t>0.0238 ± 0.0021</w:t>
             </w:r>
           </w:p>
         </w:tc>
@@ -3330,7 +3330,7 @@
                 <w:b w:val="0"/>
                 <w:sz w:val="19"/>
               </w:rPr>
-              <w:t>2.92</w:t>
+              <w:t>2.77</w:t>
             </w:r>
           </w:p>
         </w:tc>
@@ -3360,7 +3360,7 @@
                 <w:b w:val="0"/>
                 <w:sz w:val="19"/>
               </w:rPr>
-              <w:t>103.7940 ± 13.2166</w:t>
+              <w:t>55.5836 ± 14.4815</w:t>
             </w:r>
           </w:p>
         </w:tc>
@@ -3374,7 +3374,7 @@
                 <w:b w:val="0"/>
                 <w:sz w:val="19"/>
               </w:rPr>
-              <w:t>839.7676 ± 118.5879</w:t>
+              <w:t>471.3847 ± 83.6407</w:t>
             </w:r>
           </w:p>
         </w:tc>
@@ -3388,7 +3388,7 @@
                 <w:b w:val="0"/>
                 <w:sz w:val="19"/>
               </w:rPr>
-              <w:t>0.6646 ± 0.0175</w:t>
+              <w:t>0.4062 ± 0.0153</w:t>
             </w:r>
           </w:p>
         </w:tc>
@@ -3402,7 +3402,7 @@
                 <w:b w:val="0"/>
                 <w:sz w:val="19"/>
               </w:rPr>
-              <w:t>1263.57</w:t>
+              <w:t>1160.47</w:t>
             </w:r>
           </w:p>
         </w:tc>
@@ -3415,7 +3415,7 @@
           <w:i/>
           <w:sz w:val="18"/>
         </w:rPr>
-        <w:t>Sender container, median of three bench.py runs (results.csv = results_run2.csv); 1024-byte UID-seeded message; 5 warm-up calls, then key generation x20, signing x100, verification x100, each call timed with time.perf_counter_ns().</w:t>
+        <w:t>Sender container, median of three bench.py runs (results.csv = results_run3.csv); 1024-byte UID-seeded message; 5 warm-up calls, then key generation x20, signing x100, verification x100, each call timed with time.perf_counter_ns().</w:t>
       </w:r>
     </w:p>
     <w:p>
@@ -3620,7 +3620,7 @@
           <w:i/>
           <w:sz w:val="17"/>
         </w:rPr>
-        <w:t>Graph 1: Public-key and private-key size (bytes, log scale). Environment: CPU: Intel(R) Xeon(R) Processor @ 2.80GHz (4 threads), RAM 15Gi; Host: Ubuntu 24.04.5 LTS, kernel 6.18.44-fc-v139, Docker version 29.8.2; Container: Ubuntu 24.04.5 LTS, cryptography 50.0.2, liboqs 0.16.0. UID 2024300032.</w:t>
+        <w:t>Graph 1: Public-key and private-key size (bytes, log scale). Environment: CPU: 12th Gen Intel(R) Core(TM) i5-1235U (12 threads), RAM 3.7Gi; Host: Ubuntu 24.04.5 LTS, kernel 6.6.87.2-microsoft-standard-WSL2, Docker version 29.8.2; Container: Ubuntu 24.04.5 LTS, cryptography 50.0.2, liboqs 0.16.0. UID 2024300032.</w:t>
       </w:r>
     </w:p>
     <w:p>
@@ -3672,7 +3672,7 @@
           <w:i/>
           <w:sz w:val="17"/>
         </w:rPr>
-        <w:t>Graph 2: Signature size (bytes, log scale). Environment: CPU: Intel(R) Xeon(R) Processor @ 2.80GHz (4 threads), RAM 15Gi; Host: Ubuntu 24.04.5 LTS, kernel 6.18.44-fc-v139, Docker version 29.8.2; Container: Ubuntu 24.04.5 LTS, cryptography 50.0.2, liboqs 0.16.0. UID 2024300032.</w:t>
+        <w:t>Graph 2: Signature size (bytes, log scale). Environment: CPU: 12th Gen Intel(R) Core(TM) i5-1235U (12 threads), RAM 3.7Gi; Host: Ubuntu 24.04.5 LTS, kernel 6.6.87.2-microsoft-standard-WSL2, Docker version 29.8.2; Container: Ubuntu 24.04.5 LTS, cryptography 50.0.2, liboqs 0.16.0. UID 2024300032.</w:t>
       </w:r>
     </w:p>
     <w:p>
@@ -3724,7 +3724,7 @@
           <w:i/>
           <w:sz w:val="17"/>
         </w:rPr>
-        <w:t>Graph 3: Average signing time (ms, log scale); error bar = standard deviation, n = 100. Environment: CPU: Intel(R) Xeon(R) Processor @ 2.80GHz (4 threads), RAM 15Gi; Host: Ubuntu 24.04.5 LTS, kernel 6.18.44-fc-v139, Docker version 29.8.2; Container: Ubuntu 24.04.5 LTS, cryptography 50.0.2, liboqs 0.16.0. UID 2024300032.</w:t>
+        <w:t>Graph 3: Average signing time (ms, log scale); error bar = standard deviation, n = 100. Environment: CPU: 12th Gen Intel(R) Core(TM) i5-1235U (12 threads), RAM 3.7Gi; Host: Ubuntu 24.04.5 LTS, kernel 6.6.87.2-microsoft-standard-WSL2, Docker version 29.8.2; Container: Ubuntu 24.04.5 LTS, cryptography 50.0.2, liboqs 0.16.0. UID 2024300032.</w:t>
       </w:r>
     </w:p>
     <w:p>
@@ -3776,7 +3776,7 @@
           <w:i/>
           <w:sz w:val="17"/>
         </w:rPr>
-        <w:t>Graph 4: Average verification time (ms, log scale); error bar = standard deviation, n = 100. Environment: CPU: Intel(R) Xeon(R) Processor @ 2.80GHz (4 threads), RAM 15Gi; Host: Ubuntu 24.04.5 LTS, kernel 6.18.44-fc-v139, Docker version 29.8.2; Container: Ubuntu 24.04.5 LTS, cryptography 50.0.2, liboqs 0.16.0. UID 2024300032.</w:t>
+        <w:t>Graph 4: Average verification time (ms, log scale); error bar = standard deviation, n = 100. Environment: CPU: 12th Gen Intel(R) Core(TM) i5-1235U (12 threads), RAM 3.7Gi; Host: Ubuntu 24.04.5 LTS, kernel 6.6.87.2-microsoft-standard-WSL2, Docker version 29.8.2; Container: Ubuntu 24.04.5 LTS, cryptography 50.0.2, liboqs 0.16.0. UID 2024300032.</w:t>
       </w:r>
     </w:p>
     <w:p>
@@ -3828,7 +3828,7 @@
           <w:i/>
           <w:sz w:val="17"/>
         </w:rPr>
-        <w:t>Graph 5: Average key-generation time (ms, log scale), n = 20. Environment: CPU: Intel(R) Xeon(R) Processor @ 2.80GHz (4 threads), RAM 15Gi; Host: Ubuntu 24.04.5 LTS, kernel 6.18.44-fc-v139, Docker version 29.8.2; Container: Ubuntu 24.04.5 LTS, cryptography 50.0.2, liboqs 0.16.0. UID 2024300032.</w:t>
+        <w:t>Graph 5: Average key-generation time (ms, log scale), n = 20. Environment: CPU: 12th Gen Intel(R) Core(TM) i5-1235U (12 threads), RAM 3.7Gi; Host: Ubuntu 24.04.5 LTS, kernel 6.6.87.2-microsoft-standard-WSL2, Docker version 29.8.2; Container: Ubuntu 24.04.5 LTS, cryptography 50.0.2, liboqs 0.16.0. UID 2024300032.</w:t>
       </w:r>
     </w:p>
     <w:p>
@@ -3880,7 +3880,7 @@
           <w:i/>
           <w:sz w:val="17"/>
         </w:rPr>
-        <w:t>Graph 6: Total transmitted bytes = document + signature + public key. Environment: CPU: Intel(R) Xeon(R) Processor @ 2.80GHz (4 threads), RAM 15Gi; Host: Ubuntu 24.04.5 LTS, kernel 6.18.44-fc-v139, Docker version 29.8.2; Container: Ubuntu 24.04.5 LTS, cryptography 50.0.2, liboqs 0.16.0. UID 2024300032.</w:t>
+        <w:t>Graph 6: Total transmitted bytes = document + signature + public key. Environment: CPU: 12th Gen Intel(R) Core(TM) i5-1235U (12 threads), RAM 3.7Gi; Host: Ubuntu 24.04.5 LTS, kernel 6.6.87.2-microsoft-standard-WSL2, Docker version 29.8.2; Container: Ubuntu 24.04.5 LTS, cryptography 50.0.2, liboqs 0.16.0. UID 2024300032.</w:t>
       </w:r>
     </w:p>
     <w:p>
@@ -3932,7 +3932,7 @@
           <w:i/>
           <w:sz w:val="17"/>
         </w:rPr>
-        <w:t>Graph 7 (extra): Sign, verify and key-generation time relative to ECDSA (ECDSA = 1, log scale). Environment: CPU: Intel(R) Xeon(R) Processor @ 2.80GHz (4 threads), RAM 15Gi; Host: Ubuntu 24.04.5 LTS, kernel 6.18.44-fc-v139, Docker version 29.8.2; Container: Ubuntu 24.04.5 LTS, cryptography 50.0.2, liboqs 0.16.0. UID 2024300032.</w:t>
+        <w:t>Graph 7 (extra): Sign, verify and key-generation time relative to ECDSA (ECDSA = 1, log scale). Environment: CPU: 12th Gen Intel(R) Core(TM) i5-1235U (12 threads), RAM 3.7Gi; Host: Ubuntu 24.04.5 LTS, kernel 6.6.87.2-microsoft-standard-WSL2, Docker version 29.8.2; Container: Ubuntu 24.04.5 LTS, cryptography 50.0.2, liboqs 0.16.0. UID 2024300032.</w:t>
       </w:r>
     </w:p>
     <w:p>
@@ -4324,7 +4324,7 @@
                 <w:b w:val="0"/>
                 <w:sz w:val="19"/>
               </w:rPr>
-              <w:t>39.84</w:t>
+              <w:t>30.19</w:t>
             </w:r>
           </w:p>
         </w:tc>
@@ -4341,7 +4341,7 @@
                 <w:b w:val="0"/>
                 <w:sz w:val="19"/>
               </w:rPr>
-              <w:t>1.87</w:t>
+              <w:t>1.49</w:t>
             </w:r>
           </w:p>
         </w:tc>
@@ -4358,7 +4358,7 @@
                 <w:b w:val="0"/>
                 <w:sz w:val="19"/>
               </w:rPr>
-              <w:t>15049.60</w:t>
+              <w:t>10664.81</w:t>
             </w:r>
           </w:p>
         </w:tc>
@@ -4411,7 +4411,7 @@
                 <w:b w:val="0"/>
                 <w:sz w:val="19"/>
               </w:rPr>
-              <w:t>0.46</w:t>
+              <w:t>0.28</w:t>
             </w:r>
           </w:p>
         </w:tc>
@@ -4428,7 +4428,7 @@
                 <w:b w:val="0"/>
                 <w:sz w:val="19"/>
               </w:rPr>
-              <w:t>0.28</w:t>
+              <w:t>0.19</w:t>
             </w:r>
           </w:p>
         </w:tc>
@@ -4445,7 +4445,7 @@
                 <w:b w:val="0"/>
                 <w:sz w:val="19"/>
               </w:rPr>
-              <w:t>5.15</w:t>
+              <w:t>3.28</w:t>
             </w:r>
           </w:p>
         </w:tc>
@@ -4498,7 +4498,7 @@
                 <w:b w:val="0"/>
                 <w:sz w:val="19"/>
               </w:rPr>
-              <w:t>2820.39</w:t>
+              <w:t>2148.87</w:t>
             </w:r>
           </w:p>
         </w:tc>
@@ -4515,7 +4515,7 @@
                 <w:b w:val="0"/>
                 <w:sz w:val="19"/>
               </w:rPr>
-              <w:t>0.59</w:t>
+              <w:t>0.27</w:t>
             </w:r>
           </w:p>
         </w:tc>
@@ -4532,7 +4532,7 @@
                 <w:b w:val="0"/>
                 <w:sz w:val="19"/>
               </w:rPr>
-              <w:t>1356.78</w:t>
+              <w:t>602.86</w:t>
             </w:r>
           </w:p>
         </w:tc>
@@ -5278,7 +5278,7 @@
                 <w:b w:val="0"/>
                 <w:sz w:val="17"/>
               </w:rPr>
-              <w:t>Signing (0.056 ms)</w:t>
+              <w:t>Signing (0.044 ms)</w:t>
             </w:r>
           </w:p>
         </w:tc>
@@ -5295,7 +5295,7 @@
                 <w:b w:val="0"/>
                 <w:sz w:val="17"/>
               </w:rPr>
-              <w:t>Verification (0.059 ms)</w:t>
+              <w:t>Verification (0.034 ms)</w:t>
             </w:r>
           </w:p>
         </w:tc>
@@ -5312,7 +5312,7 @@
                 <w:b w:val="0"/>
                 <w:sz w:val="17"/>
               </w:rPr>
-              <w:t>Verification (0.036 ms)</w:t>
+              <w:t>Verification (0.024 ms)</w:t>
             </w:r>
           </w:p>
         </w:tc>
@@ -5329,7 +5329,7 @@
                 <w:b w:val="0"/>
                 <w:sz w:val="17"/>
               </w:rPr>
-              <w:t>Verification (0.665 ms)</w:t>
+              <w:t>Verification (0.406 ms)</w:t>
             </w:r>
           </w:p>
         </w:tc>
@@ -5365,7 +5365,7 @@
                 <w:b w:val="0"/>
                 <w:sz w:val="17"/>
               </w:rPr>
-              <w:t>Verification (0.129 ms)</w:t>
+              <w:t>Verification (0.124 ms)</w:t>
             </w:r>
           </w:p>
         </w:tc>
@@ -5382,7 +5382,7 @@
                 <w:b w:val="0"/>
                 <w:sz w:val="17"/>
               </w:rPr>
-              <w:t>Key generation (215.8 ms)</w:t>
+              <w:t>Key generation (198.1 ms)</w:t>
             </w:r>
           </w:p>
         </w:tc>
@@ -5399,7 +5399,7 @@
                 <w:b w:val="0"/>
                 <w:sz w:val="17"/>
               </w:rPr>
-              <w:t>Signing (0.104 ms)</w:t>
+              <w:t>Signing (0.066 ms)</w:t>
             </w:r>
           </w:p>
         </w:tc>
@@ -5416,7 +5416,7 @@
                 <w:b w:val="0"/>
                 <w:sz w:val="17"/>
               </w:rPr>
-              <w:t>Signing (839.8 ms)</w:t>
+              <w:t>Signing (471.4 ms)</w:t>
             </w:r>
           </w:p>
         </w:tc>
@@ -5996,7 +5996,7 @@
                 <w:b w:val="0"/>
                 <w:sz w:val="18"/>
               </w:rPr>
-              <w:t>Fastest verification in our measurements (0.036 ms per signature on this setup) and quantum-safe.</w:t>
+              <w:t>Fastest verification in our measurements (0.024 ms per signature on this setup) and quantum-safe.</w:t>
             </w:r>
           </w:p>
         </w:tc>
@@ -13362,7 +13362,7 @@
         <w:pStyle w:val="Heading2"/>
       </w:pPr>
       <w:r>
-        <w:t>Sender results.csv (median run = results_run2.csv)</w:t>
+        <w:t>Sender results.csv (median run = results_run3.csv)</w:t>
       </w:r>
     </w:p>
     <w:tbl>
@@ -13667,7 +13667,7 @@
                 <w:b w:val="0"/>
                 <w:sz w:val="15"/>
               </w:rPr>
-              <w:t>0.0765</w:t>
+              <w:t>0.0922</w:t>
             </w:r>
           </w:p>
         </w:tc>
@@ -13684,7 +13684,7 @@
                 <w:b w:val="0"/>
                 <w:sz w:val="15"/>
               </w:rPr>
-              <w:t>0.0187</w:t>
+              <w:t>0.0324</w:t>
             </w:r>
           </w:p>
         </w:tc>
@@ -13701,7 +13701,7 @@
                 <w:b w:val="0"/>
                 <w:sz w:val="15"/>
               </w:rPr>
-              <w:t>0.0637</w:t>
+              <w:t>0.0795</w:t>
             </w:r>
           </w:p>
         </w:tc>
@@ -13718,7 +13718,7 @@
                 <w:b w:val="0"/>
                 <w:sz w:val="15"/>
               </w:rPr>
-              <w:t>0.1487</w:t>
+              <w:t>0.1998</w:t>
             </w:r>
           </w:p>
         </w:tc>
@@ -13769,7 +13769,7 @@
                 <w:b w:val="0"/>
                 <w:sz w:val="15"/>
               </w:rPr>
-              <w:t>71</w:t>
+              <w:t>72</w:t>
             </w:r>
           </w:p>
         </w:tc>
@@ -13856,7 +13856,7 @@
                 <w:b w:val="0"/>
                 <w:sz w:val="15"/>
               </w:rPr>
-              <w:t>0.0558</w:t>
+              <w:t>0.0442</w:t>
             </w:r>
           </w:p>
         </w:tc>
@@ -13873,7 +13873,7 @@
                 <w:b w:val="0"/>
                 <w:sz w:val="15"/>
               </w:rPr>
-              <w:t>0.0225</w:t>
+              <w:t>0.0087</w:t>
             </w:r>
           </w:p>
         </w:tc>
@@ -13890,7 +13890,7 @@
                 <w:b w:val="0"/>
                 <w:sz w:val="15"/>
               </w:rPr>
-              <w:t>0.0389</w:t>
+              <w:t>0.0395</w:t>
             </w:r>
           </w:p>
         </w:tc>
@@ -13907,7 +13907,7 @@
                 <w:b w:val="0"/>
                 <w:sz w:val="15"/>
               </w:rPr>
-              <w:t>0.1707</w:t>
+              <w:t>0.0983</w:t>
             </w:r>
           </w:p>
         </w:tc>
@@ -13958,7 +13958,7 @@
                 <w:b w:val="0"/>
                 <w:sz w:val="15"/>
               </w:rPr>
-              <w:t>71</w:t>
+              <w:t>72</w:t>
             </w:r>
           </w:p>
         </w:tc>
@@ -14045,7 +14045,7 @@
                 <w:b w:val="0"/>
                 <w:sz w:val="15"/>
               </w:rPr>
-              <w:t>0.1291</w:t>
+              <w:t>0.1239</w:t>
             </w:r>
           </w:p>
         </w:tc>
@@ -14062,7 +14062,7 @@
                 <w:b w:val="0"/>
                 <w:sz w:val="15"/>
               </w:rPr>
-              <w:t>0.0261</w:t>
+              <w:t>0.0092</w:t>
             </w:r>
           </w:p>
         </w:tc>
@@ -14079,7 +14079,7 @@
                 <w:b w:val="0"/>
                 <w:sz w:val="15"/>
               </w:rPr>
-              <w:t>0.1009</w:t>
+              <w:t>0.1119</w:t>
             </w:r>
           </w:p>
         </w:tc>
@@ -14096,7 +14096,7 @@
                 <w:b w:val="0"/>
                 <w:sz w:val="15"/>
               </w:rPr>
-              <w:t>0.2590</w:t>
+              <w:t>0.1632</w:t>
             </w:r>
           </w:p>
         </w:tc>
@@ -14147,7 +14147,7 @@
                 <w:b w:val="0"/>
                 <w:sz w:val="15"/>
               </w:rPr>
-              <w:t>71</w:t>
+              <w:t>72</w:t>
             </w:r>
           </w:p>
         </w:tc>
@@ -14234,7 +14234,7 @@
                 <w:b w:val="0"/>
                 <w:sz w:val="15"/>
               </w:rPr>
-              <w:t>215.7596</w:t>
+              <w:t>198.1258</w:t>
             </w:r>
           </w:p>
         </w:tc>
@@ -14251,7 +14251,7 @@
                 <w:b w:val="0"/>
                 <w:sz w:val="15"/>
               </w:rPr>
-              <w:t>172.9181</w:t>
+              <w:t>102.1346</w:t>
             </w:r>
           </w:p>
         </w:tc>
@@ -14268,7 +14268,7 @@
                 <w:b w:val="0"/>
                 <w:sz w:val="15"/>
               </w:rPr>
-              <w:t>34.3285</w:t>
+              <w:t>38.9473</w:t>
             </w:r>
           </w:p>
         </w:tc>
@@ -14285,7 +14285,7 @@
                 <w:b w:val="0"/>
                 <w:sz w:val="15"/>
               </w:rPr>
-              <w:t>663.4801</w:t>
+              <w:t>383.2885</w:t>
             </w:r>
           </w:p>
         </w:tc>
@@ -14319,7 +14319,7 @@
                 <w:b w:val="0"/>
                 <w:sz w:val="15"/>
               </w:rPr>
-              <w:t>1793</w:t>
+              <w:t>1795</w:t>
             </w:r>
           </w:p>
         </w:tc>
@@ -14423,7 +14423,7 @@
                 <w:b w:val="0"/>
                 <w:sz w:val="15"/>
               </w:rPr>
-              <w:t>2.2231</w:t>
+              <w:t>1.3343</w:t>
             </w:r>
           </w:p>
         </w:tc>
@@ -14440,7 +14440,7 @@
                 <w:b w:val="0"/>
                 <w:sz w:val="15"/>
               </w:rPr>
-              <w:t>0.6104</w:t>
+              <w:t>0.0675</w:t>
             </w:r>
           </w:p>
         </w:tc>
@@ -14457,7 +14457,7 @@
                 <w:b w:val="0"/>
                 <w:sz w:val="15"/>
               </w:rPr>
-              <w:t>1.8540</w:t>
+              <w:t>1.3006</w:t>
             </w:r>
           </w:p>
         </w:tc>
@@ -14474,7 +14474,7 @@
                 <w:b w:val="0"/>
                 <w:sz w:val="15"/>
               </w:rPr>
-              <w:t>6.9156</w:t>
+              <w:t>1.7054</w:t>
             </w:r>
           </w:p>
         </w:tc>
@@ -14508,7 +14508,7 @@
                 <w:b w:val="0"/>
                 <w:sz w:val="15"/>
               </w:rPr>
-              <w:t>1793</w:t>
+              <w:t>1795</w:t>
             </w:r>
           </w:p>
         </w:tc>
@@ -14612,7 +14612,7 @@
                 <w:b w:val="0"/>
                 <w:sz w:val="15"/>
               </w:rPr>
-              <w:t>0.0589</w:t>
+              <w:t>0.0342</w:t>
             </w:r>
           </w:p>
         </w:tc>
@@ -14629,7 +14629,7 @@
                 <w:b w:val="0"/>
                 <w:sz w:val="15"/>
               </w:rPr>
-              <w:t>0.0108</w:t>
+              <w:t>0.0017</w:t>
             </w:r>
           </w:p>
         </w:tc>
@@ -14646,7 +14646,7 @@
                 <w:b w:val="0"/>
                 <w:sz w:val="15"/>
               </w:rPr>
-              <w:t>0.0524</w:t>
+              <w:t>0.0333</w:t>
             </w:r>
           </w:p>
         </w:tc>
@@ -14663,7 +14663,7 @@
                 <w:b w:val="0"/>
                 <w:sz w:val="15"/>
               </w:rPr>
-              <w:t>0.1047</w:t>
+              <w:t>0.0424</w:t>
             </w:r>
           </w:p>
         </w:tc>
@@ -14697,7 +14697,7 @@
                 <w:b w:val="0"/>
                 <w:sz w:val="15"/>
               </w:rPr>
-              <w:t>1793</w:t>
+              <w:t>1795</w:t>
             </w:r>
           </w:p>
         </w:tc>
@@ -14801,7 +14801,7 @@
                 <w:b w:val="0"/>
                 <w:sz w:val="15"/>
               </w:rPr>
-              <w:t>0.0454</w:t>
+              <w:t>0.0250</w:t>
             </w:r>
           </w:p>
         </w:tc>
@@ -14818,7 +14818,7 @@
                 <w:b w:val="0"/>
                 <w:sz w:val="15"/>
               </w:rPr>
-              <w:t>0.0099</w:t>
+              <w:t>0.0006</w:t>
             </w:r>
           </w:p>
         </w:tc>
@@ -14835,7 +14835,7 @@
                 <w:b w:val="0"/>
                 <w:sz w:val="15"/>
               </w:rPr>
-              <w:t>0.0395</w:t>
+              <w:t>0.0244</w:t>
             </w:r>
           </w:p>
         </w:tc>
@@ -14852,7 +14852,7 @@
                 <w:b w:val="0"/>
                 <w:sz w:val="15"/>
               </w:rPr>
-              <w:t>0.0843</w:t>
+              <w:t>0.0270</w:t>
             </w:r>
           </w:p>
         </w:tc>
@@ -14990,7 +14990,7 @@
                 <w:b w:val="0"/>
                 <w:sz w:val="15"/>
               </w:rPr>
-              <w:t>0.1041</w:t>
+              <w:t>0.0659</w:t>
             </w:r>
           </w:p>
         </w:tc>
@@ -15007,7 +15007,7 @@
                 <w:b w:val="0"/>
                 <w:sz w:val="15"/>
               </w:rPr>
-              <w:t>0.0572</w:t>
+              <w:t>0.0337</w:t>
             </w:r>
           </w:p>
         </w:tc>
@@ -15024,7 +15024,7 @@
                 <w:b w:val="0"/>
                 <w:sz w:val="15"/>
               </w:rPr>
-              <w:t>0.0481</w:t>
+              <w:t>0.0307</w:t>
             </w:r>
           </w:p>
         </w:tc>
@@ -15041,7 +15041,7 @@
                 <w:b w:val="0"/>
                 <w:sz w:val="15"/>
               </w:rPr>
-              <w:t>0.2921</w:t>
+              <w:t>0.1682</w:t>
             </w:r>
           </w:p>
         </w:tc>
@@ -15179,7 +15179,7 @@
                 <w:b w:val="0"/>
                 <w:sz w:val="15"/>
               </w:rPr>
-              <w:t>0.0357</w:t>
+              <w:t>0.0238</w:t>
             </w:r>
           </w:p>
         </w:tc>
@@ -15196,7 +15196,7 @@
                 <w:b w:val="0"/>
                 <w:sz w:val="15"/>
               </w:rPr>
-              <w:t>0.0067</w:t>
+              <w:t>0.0021</w:t>
             </w:r>
           </w:p>
         </w:tc>
@@ -15213,7 +15213,7 @@
                 <w:b w:val="0"/>
                 <w:sz w:val="15"/>
               </w:rPr>
-              <w:t>0.0331</w:t>
+              <w:t>0.0228</w:t>
             </w:r>
           </w:p>
         </w:tc>
@@ -15230,7 +15230,7 @@
                 <w:b w:val="0"/>
                 <w:sz w:val="15"/>
               </w:rPr>
-              <w:t>0.0799</w:t>
+              <w:t>0.0332</w:t>
             </w:r>
           </w:p>
         </w:tc>
@@ -15368,7 +15368,7 @@
                 <w:b w:val="0"/>
                 <w:sz w:val="15"/>
               </w:rPr>
-              <w:t>103.7940</w:t>
+              <w:t>55.5836</w:t>
             </w:r>
           </w:p>
         </w:tc>
@@ -15385,7 +15385,7 @@
                 <w:b w:val="0"/>
                 <w:sz w:val="15"/>
               </w:rPr>
-              <w:t>13.2166</w:t>
+              <w:t>14.4815</w:t>
             </w:r>
           </w:p>
         </w:tc>
@@ -15402,7 +15402,7 @@
                 <w:b w:val="0"/>
                 <w:sz w:val="15"/>
               </w:rPr>
-              <w:t>89.0875</w:t>
+              <w:t>47.3222</w:t>
             </w:r>
           </w:p>
         </w:tc>
@@ -15419,7 +15419,7 @@
                 <w:b w:val="0"/>
                 <w:sz w:val="15"/>
               </w:rPr>
-              <w:t>129.4558</w:t>
+              <w:t>100.5666</w:t>
             </w:r>
           </w:p>
         </w:tc>
@@ -15557,7 +15557,7 @@
                 <w:b w:val="0"/>
                 <w:sz w:val="15"/>
               </w:rPr>
-              <w:t>839.7676</w:t>
+              <w:t>471.3847</w:t>
             </w:r>
           </w:p>
         </w:tc>
@@ -15574,7 +15574,7 @@
                 <w:b w:val="0"/>
                 <w:sz w:val="15"/>
               </w:rPr>
-              <w:t>118.5879</w:t>
+              <w:t>83.6407</w:t>
             </w:r>
           </w:p>
         </w:tc>
@@ -15591,7 +15591,7 @@
                 <w:b w:val="0"/>
                 <w:sz w:val="15"/>
               </w:rPr>
-              <w:t>663.9100</w:t>
+              <w:t>368.0724</w:t>
             </w:r>
           </w:p>
         </w:tc>
@@ -15608,7 +15608,7 @@
                 <w:b w:val="0"/>
                 <w:sz w:val="15"/>
               </w:rPr>
-              <w:t>1226.1801</w:t>
+              <w:t>857.8316</w:t>
             </w:r>
           </w:p>
         </w:tc>
@@ -15731,7 +15731,7 @@
                 <w:b w:val="0"/>
                 <w:sz w:val="15"/>
               </w:rPr>
-              <w:t>0.6646</w:t>
+              <w:t>0.4062</w:t>
             </w:r>
           </w:p>
         </w:tc>
@@ -15745,7 +15745,7 @@
                 <w:b w:val="0"/>
                 <w:sz w:val="15"/>
               </w:rPr>
-              <w:t>0.0175</w:t>
+              <w:t>0.0153</w:t>
             </w:r>
           </w:p>
         </w:tc>
@@ -15759,7 +15759,7 @@
                 <w:b w:val="0"/>
                 <w:sz w:val="15"/>
               </w:rPr>
-              <w:t>0.6427</w:t>
+              <w:t>0.3659</w:t>
             </w:r>
           </w:p>
         </w:tc>
@@ -15773,7 +15773,7 @@
                 <w:b w:val="0"/>
                 <w:sz w:val="15"/>
               </w:rPr>
-              <w:t>0.7716</w:t>
+              <w:t>0.4926</w:t>
             </w:r>
           </w:p>
         </w:tc>
@@ -16131,7 +16131,7 @@
                 <w:b w:val="0"/>
                 <w:sz w:val="15"/>
               </w:rPr>
-              <w:t>0.0908</w:t>
+              <w:t>0.0324</w:t>
             </w:r>
           </w:p>
         </w:tc>
@@ -16148,7 +16148,7 @@
                 <w:b w:val="0"/>
                 <w:sz w:val="15"/>
               </w:rPr>
-              <w:t>0.0204</w:t>
+              <w:t>0.0054</w:t>
             </w:r>
           </w:p>
         </w:tc>
@@ -16165,7 +16165,7 @@
                 <w:b w:val="0"/>
                 <w:sz w:val="15"/>
               </w:rPr>
-              <w:t>0.0787</w:t>
+              <w:t>0.0302</w:t>
             </w:r>
           </w:p>
         </w:tc>
@@ -16182,7 +16182,7 @@
                 <w:b w:val="0"/>
                 <w:sz w:val="15"/>
               </w:rPr>
-              <w:t>0.1586</w:t>
+              <w:t>0.0544</w:t>
             </w:r>
           </w:p>
         </w:tc>
@@ -16233,7 +16233,7 @@
                 <w:b w:val="0"/>
                 <w:sz w:val="15"/>
               </w:rPr>
-              <w:t>71</w:t>
+              <w:t>70</w:t>
             </w:r>
           </w:p>
         </w:tc>
@@ -16320,7 +16320,7 @@
                 <w:b w:val="0"/>
                 <w:sz w:val="15"/>
               </w:rPr>
-              <w:t>0.0559</w:t>
+              <w:t>0.0194</w:t>
             </w:r>
           </w:p>
         </w:tc>
@@ -16337,7 +16337,7 @@
                 <w:b w:val="0"/>
                 <w:sz w:val="15"/>
               </w:rPr>
-              <w:t>0.0136</w:t>
+              <w:t>0.0015</w:t>
             </w:r>
           </w:p>
         </w:tc>
@@ -16354,7 +16354,7 @@
                 <w:b w:val="0"/>
                 <w:sz w:val="15"/>
               </w:rPr>
-              <w:t>0.0453</w:t>
+              <w:t>0.0188</w:t>
             </w:r>
           </w:p>
         </w:tc>
@@ -16371,7 +16371,7 @@
                 <w:b w:val="0"/>
                 <w:sz w:val="15"/>
               </w:rPr>
-              <w:t>0.1295</w:t>
+              <w:t>0.0326</w:t>
             </w:r>
           </w:p>
         </w:tc>
@@ -16422,7 +16422,7 @@
                 <w:b w:val="0"/>
                 <w:sz w:val="15"/>
               </w:rPr>
-              <w:t>71</w:t>
+              <w:t>70</w:t>
             </w:r>
           </w:p>
         </w:tc>
@@ -16509,7 +16509,7 @@
                 <w:b w:val="0"/>
                 <w:sz w:val="15"/>
               </w:rPr>
-              <w:t>0.1522</w:t>
+              <w:t>0.0597</w:t>
             </w:r>
           </w:p>
         </w:tc>
@@ -16526,7 +16526,7 @@
                 <w:b w:val="0"/>
                 <w:sz w:val="15"/>
               </w:rPr>
-              <w:t>0.0246</w:t>
+              <w:t>0.0124</w:t>
             </w:r>
           </w:p>
         </w:tc>
@@ -16543,7 +16543,7 @@
                 <w:b w:val="0"/>
                 <w:sz w:val="15"/>
               </w:rPr>
-              <w:t>0.1016</w:t>
+              <w:t>0.0532</w:t>
             </w:r>
           </w:p>
         </w:tc>
@@ -16560,7 +16560,7 @@
                 <w:b w:val="0"/>
                 <w:sz w:val="15"/>
               </w:rPr>
-              <w:t>0.2678</w:t>
+              <w:t>0.1340</w:t>
             </w:r>
           </w:p>
         </w:tc>
@@ -16611,7 +16611,7 @@
                 <w:b w:val="0"/>
                 <w:sz w:val="15"/>
               </w:rPr>
-              <w:t>71</w:t>
+              <w:t>70</w:t>
             </w:r>
           </w:p>
         </w:tc>
@@ -16698,7 +16698,7 @@
                 <w:b w:val="0"/>
                 <w:sz w:val="15"/>
               </w:rPr>
-              <w:t>258.2299</w:t>
+              <w:t>115.7305</w:t>
             </w:r>
           </w:p>
         </w:tc>
@@ -16715,7 +16715,7 @@
                 <w:b w:val="0"/>
                 <w:sz w:val="15"/>
               </w:rPr>
-              <w:t>166.1175</w:t>
+              <w:t>76.3442</w:t>
             </w:r>
           </w:p>
         </w:tc>
@@ -16732,7 +16732,7 @@
                 <w:b w:val="0"/>
                 <w:sz w:val="15"/>
               </w:rPr>
-              <w:t>75.0116</w:t>
+              <w:t>49.8620</w:t>
             </w:r>
           </w:p>
         </w:tc>
@@ -16749,7 +16749,7 @@
                 <w:b w:val="0"/>
                 <w:sz w:val="15"/>
               </w:rPr>
-              <w:t>620.7739</w:t>
+              <w:t>323.9396</w:t>
             </w:r>
           </w:p>
         </w:tc>
@@ -16783,7 +16783,7 @@
                 <w:b w:val="0"/>
                 <w:sz w:val="15"/>
               </w:rPr>
-              <w:t>1793</w:t>
+              <w:t>1794</w:t>
             </w:r>
           </w:p>
         </w:tc>
@@ -16887,7 +16887,7 @@
                 <w:b w:val="0"/>
                 <w:sz w:val="15"/>
               </w:rPr>
-              <w:t>2.6541</w:t>
+              <w:t>1.3643</w:t>
             </w:r>
           </w:p>
         </w:tc>
@@ -16904,7 +16904,7 @@
                 <w:b w:val="0"/>
                 <w:sz w:val="15"/>
               </w:rPr>
-              <w:t>0.7561</w:t>
+              <w:t>0.1119</w:t>
             </w:r>
           </w:p>
         </w:tc>
@@ -16921,7 +16921,7 @@
                 <w:b w:val="0"/>
                 <w:sz w:val="15"/>
               </w:rPr>
-              <w:t>1.8775</w:t>
+              <w:t>1.3034</w:t>
             </w:r>
           </w:p>
         </w:tc>
@@ -16938,7 +16938,7 @@
                 <w:b w:val="0"/>
                 <w:sz w:val="15"/>
               </w:rPr>
-              <w:t>4.3344</w:t>
+              <w:t>2.0226</w:t>
             </w:r>
           </w:p>
         </w:tc>
@@ -16972,7 +16972,7 @@
                 <w:b w:val="0"/>
                 <w:sz w:val="15"/>
               </w:rPr>
-              <w:t>1793</w:t>
+              <w:t>1794</w:t>
             </w:r>
           </w:p>
         </w:tc>
@@ -17076,7 +17076,7 @@
                 <w:b w:val="0"/>
                 <w:sz w:val="15"/>
               </w:rPr>
-              <w:t>0.0875</w:t>
+              <w:t>0.0347</w:t>
             </w:r>
           </w:p>
         </w:tc>
@@ -17093,7 +17093,7 @@
                 <w:b w:val="0"/>
                 <w:sz w:val="15"/>
               </w:rPr>
-              <w:t>0.1650</w:t>
+              <w:t>0.0026</w:t>
             </w:r>
           </w:p>
         </w:tc>
@@ -17110,7 +17110,7 @@
                 <w:b w:val="0"/>
                 <w:sz w:val="15"/>
               </w:rPr>
-              <w:t>0.0527</w:t>
+              <w:t>0.0332</w:t>
             </w:r>
           </w:p>
         </w:tc>
@@ -17127,7 +17127,7 @@
                 <w:b w:val="0"/>
                 <w:sz w:val="15"/>
               </w:rPr>
-              <w:t>1.6344</w:t>
+              <w:t>0.0489</w:t>
             </w:r>
           </w:p>
         </w:tc>
@@ -17161,7 +17161,7 @@
                 <w:b w:val="0"/>
                 <w:sz w:val="15"/>
               </w:rPr>
-              <w:t>1793</w:t>
+              <w:t>1794</w:t>
             </w:r>
           </w:p>
         </w:tc>
@@ -17265,7 +17265,7 @@
                 <w:b w:val="0"/>
                 <w:sz w:val="15"/>
               </w:rPr>
-              <w:t>0.0471</w:t>
+              <w:t>0.0279</w:t>
             </w:r>
           </w:p>
         </w:tc>
@@ -17282,7 +17282,7 @@
                 <w:b w:val="0"/>
                 <w:sz w:val="15"/>
               </w:rPr>
-              <w:t>0.0108</w:t>
+              <w:t>0.0053</w:t>
             </w:r>
           </w:p>
         </w:tc>
@@ -17299,7 +17299,7 @@
                 <w:b w:val="0"/>
                 <w:sz w:val="15"/>
               </w:rPr>
-              <w:t>0.0391</w:t>
+              <w:t>0.0248</w:t>
             </w:r>
           </w:p>
         </w:tc>
@@ -17316,7 +17316,7 @@
                 <w:b w:val="0"/>
                 <w:sz w:val="15"/>
               </w:rPr>
-              <w:t>0.0867</w:t>
+              <w:t>0.0490</w:t>
             </w:r>
           </w:p>
         </w:tc>
@@ -17454,7 +17454,7 @@
                 <w:b w:val="0"/>
                 <w:sz w:val="15"/>
               </w:rPr>
-              <w:t>0.0954</w:t>
+              <w:t>0.0632</w:t>
             </w:r>
           </w:p>
         </w:tc>
@@ -17471,7 +17471,7 @@
                 <w:b w:val="0"/>
                 <w:sz w:val="15"/>
               </w:rPr>
-              <w:t>0.0479</w:t>
+              <w:t>0.0363</w:t>
             </w:r>
           </w:p>
         </w:tc>
@@ -17488,7 +17488,7 @@
                 <w:b w:val="0"/>
                 <w:sz w:val="15"/>
               </w:rPr>
-              <w:t>0.0474</w:t>
+              <w:t>0.0308</w:t>
             </w:r>
           </w:p>
         </w:tc>
@@ -17505,7 +17505,7 @@
                 <w:b w:val="0"/>
                 <w:sz w:val="15"/>
               </w:rPr>
-              <w:t>0.2459</w:t>
+              <w:t>0.2783</w:t>
             </w:r>
           </w:p>
         </w:tc>
@@ -17643,7 +17643,7 @@
                 <w:b w:val="0"/>
                 <w:sz w:val="15"/>
               </w:rPr>
-              <w:t>0.0365</w:t>
+              <w:t>0.0253</w:t>
             </w:r>
           </w:p>
         </w:tc>
@@ -17660,7 +17660,7 @@
                 <w:b w:val="0"/>
                 <w:sz w:val="15"/>
               </w:rPr>
-              <w:t>0.0087</w:t>
+              <w:t>0.0042</w:t>
             </w:r>
           </w:p>
         </w:tc>
@@ -17677,7 +17677,7 @@
                 <w:b w:val="0"/>
                 <w:sz w:val="15"/>
               </w:rPr>
-              <w:t>0.0329</w:t>
+              <w:t>0.0230</w:t>
             </w:r>
           </w:p>
         </w:tc>
@@ -17694,7 +17694,7 @@
                 <w:b w:val="0"/>
                 <w:sz w:val="15"/>
               </w:rPr>
-              <w:t>0.1066</w:t>
+              <w:t>0.0537</w:t>
             </w:r>
           </w:p>
         </w:tc>
@@ -17832,7 +17832,7 @@
                 <w:b w:val="0"/>
                 <w:sz w:val="15"/>
               </w:rPr>
-              <w:t>110.9689</w:t>
+              <w:t>64.1955</w:t>
             </w:r>
           </w:p>
         </w:tc>
@@ -17849,7 +17849,7 @@
                 <w:b w:val="0"/>
                 <w:sz w:val="15"/>
               </w:rPr>
-              <w:t>17.3681</w:t>
+              <w:t>23.6940</w:t>
             </w:r>
           </w:p>
         </w:tc>
@@ -17866,7 +17866,7 @@
                 <w:b w:val="0"/>
                 <w:sz w:val="15"/>
               </w:rPr>
-              <w:t>91.5047</w:t>
+              <w:t>47.6752</w:t>
             </w:r>
           </w:p>
         </w:tc>
@@ -17883,7 +17883,7 @@
                 <w:b w:val="0"/>
                 <w:sz w:val="15"/>
               </w:rPr>
-              <w:t>150.8713</w:t>
+              <w:t>132.3601</w:t>
             </w:r>
           </w:p>
         </w:tc>
@@ -18021,7 +18021,7 @@
                 <w:b w:val="0"/>
                 <w:sz w:val="15"/>
               </w:rPr>
-              <w:t>786.0777</w:t>
+              <w:t>488.9761</w:t>
             </w:r>
           </w:p>
         </w:tc>
@@ -18038,7 +18038,7 @@
                 <w:b w:val="0"/>
                 <w:sz w:val="15"/>
               </w:rPr>
-              <w:t>96.0449</w:t>
+              <w:t>68.7288</w:t>
             </w:r>
           </w:p>
         </w:tc>
@@ -18055,7 +18055,7 @@
                 <w:b w:val="0"/>
                 <w:sz w:val="15"/>
               </w:rPr>
-              <w:t>663.8267</w:t>
+              <w:t>376.9210</w:t>
             </w:r>
           </w:p>
         </w:tc>
@@ -18072,7 +18072,7 @@
                 <w:b w:val="0"/>
                 <w:sz w:val="15"/>
               </w:rPr>
-              <w:t>1360.1079</w:t>
+              <w:t>809.7748</w:t>
             </w:r>
           </w:p>
         </w:tc>
@@ -18195,7 +18195,7 @@
                 <w:b w:val="0"/>
                 <w:sz w:val="15"/>
               </w:rPr>
-              <w:t>0.6878</w:t>
+              <w:t>0.3776</w:t>
             </w:r>
           </w:p>
         </w:tc>
@@ -18209,7 +18209,7 @@
                 <w:b w:val="0"/>
                 <w:sz w:val="15"/>
               </w:rPr>
-              <w:t>0.0325</w:t>
+              <w:t>0.0156</w:t>
             </w:r>
           </w:p>
         </w:tc>
@@ -18223,7 +18223,7 @@
                 <w:b w:val="0"/>
                 <w:sz w:val="15"/>
               </w:rPr>
-              <w:t>0.6637</w:t>
+              <w:t>0.3334</w:t>
             </w:r>
           </w:p>
         </w:tc>
@@ -18237,7 +18237,7 @@
                 <w:b w:val="0"/>
                 <w:sz w:val="15"/>
               </w:rPr>
-              <w:t>0.8916</w:t>
+              <w:t>0.4416</w:t>
             </w:r>
           </w:p>
         </w:tc>

</xml_diff>